<commit_message>
Remove the Word lock file I committed, and ignore the pattern
Word creates ~$name.docx beside any open document. One reached the repository
because I ran `git add -A` while PROJECT_OVERVIEW.docx was open in Word. It is a
lock file for a session that has since ended and means nothing to anyone else.

Untracked, deleted, and ~$* added to .gitignore so the next `git add -A` during an
open document cannot repeat it.

Co-Authored-By: Claude Opus 5 <noreply@anthropic.com>
</commit_message>
<xml_diff>
--- a/PROJECT_OVERVIEW.docx
+++ b/PROJECT_OVERVIEW.docx
@@ -657,7 +657,7 @@
     </w:p>
     <w:p>
       <w:r>
-        <w:t>These two are the pair worth understanding, because they are the SAME six agents doing the SAME jobs with the SAME data. Only the configuration differs. That makes them the cleanest comparison in the project, and the source of its most useful engineering lesson.</w:t>
+        <w:t>The same six agents, the same jobs, the same data. Only the configuration differs — which makes this the cleanest comparison in the project.</w:t>
       </w:r>
     </w:p>
     <w:p>
@@ -670,7 +670,7 @@
     </w:p>
     <w:p>
       <w:r>
-        <w:t>An AI has no memory. Every time you ask it something, the program has to re-send everything: the request, the description of every tool that agent holds, and the whole conversation so far. Think of an assistant with total amnesia — before every single step you must read the instructions out again from the beginning.</w:t>
+        <w:t>An AI has no memory. Every time you ask it something, the program re-sends everything: the request, every tool description, and the whole conversation so far. Like an assistant with amnesia — you read the instructions out again before every step.</w:t>
       </w:r>
     </w:p>
     <w:p>
@@ -2854,46 +2854,230 @@
         <w:t>What the tool lists show</w:t>
       </w:r>
     </w:p>
-    <w:p>
-      <w:pPr>
-        <w:pStyle w:val="ListBullet"/>
-      </w:pPr>
-      <w:r>
-        <w:t>search_internet and calculate are held by ALL FOUR of approach B's agents. That is 8 of its 20 slots spent on two tools, and both descriptions are re-sent by every agent on every step.</w:t>
-      </w:r>
-    </w:p>
-    <w:p>
-      <w:pPr>
-        <w:pStyle w:val="ListBullet"/>
-      </w:pPr>
-      <w:r>
-        <w:t>Approach B's hotel agent has two tools that do one job in two steps — look up the city's ID code, then search with it — when search_hotels_comprehensive already does both in one call. So the agent can spend a whole AI request choosing the slow route.</w:t>
-      </w:r>
-    </w:p>
-    <w:p>
-      <w:pPr>
-        <w:pStyle w:val="ListBullet"/>
-      </w:pPr>
-      <w:r>
-        <w:t>Approach B's hotel agent also holds get_attractions_near_hotel, which is the attraction agent's job. It can wander off instead of finishing.</w:t>
-      </w:r>
-    </w:p>
-    <w:p>
-      <w:pPr>
-        <w:pStyle w:val="ListBullet"/>
-      </w:pPr>
-      <w:r>
-        <w:t>Approach B's coordinator holds four search tools, although its job is only to write the plan from what the others already found. It can search all over again.</w:t>
-      </w:r>
-    </w:p>
-    <w:p>
-      <w:pPr>
-        <w:pStyle w:val="ListBullet"/>
-      </w:pPr>
-      <w:r>
-        <w:t>Approach C removes all of that. One tool per specialist, none for the coordinator, and each tool returns the best few options instead of the full reply. Nothing the system needs was lost.</w:t>
-      </w:r>
-    </w:p>
+    <w:tbl>
+      <w:tblPr>
+        <w:tblStyle w:val="LightGrid-Accent1"/>
+        <w:tblW w:type="auto" w:w="0"/>
+        <w:tblLook w:firstColumn="1" w:firstRow="1" w:lastColumn="0" w:lastRow="0" w:noHBand="0" w:noVBand="1" w:val="04A0"/>
+      </w:tblPr>
+      <w:tblGrid>
+        <w:gridCol w:w="4824"/>
+        <w:gridCol w:w="4824"/>
+      </w:tblGrid>
+      <w:tr>
+        <w:tc>
+          <w:tcPr>
+            <w:tcW w:type="dxa" w:w="5184"/>
+          </w:tcPr>
+          <w:p>
+            <w:r/>
+            <w:r>
+              <w:rPr>
+                <w:b/>
+                <w:sz w:val="18"/>
+              </w:rPr>
+              <w:t>What the lists show about approach B</w:t>
+            </w:r>
+          </w:p>
+        </w:tc>
+        <w:tc>
+          <w:tcPr>
+            <w:tcW w:type="dxa" w:w="4032"/>
+          </w:tcPr>
+          <w:p>
+            <w:r/>
+            <w:r>
+              <w:rPr>
+                <w:b/>
+                <w:sz w:val="18"/>
+              </w:rPr>
+              <w:t>What approach C did</w:t>
+            </w:r>
+          </w:p>
+        </w:tc>
+      </w:tr>
+      <w:tr>
+        <w:tc>
+          <w:tcPr>
+            <w:tcW w:type="dxa" w:w="5184"/>
+          </w:tcPr>
+          <w:p>
+            <w:pPr>
+              <w:spacing w:after="40"/>
+            </w:pPr>
+            <w:r/>
+            <w:r>
+              <w:rPr>
+                <w:sz w:val="18"/>
+              </w:rPr>
+              <w:t>search_internet and calculate sit on ALL FOUR agents — 8 of the 20 slots on two tools, re-sent by every agent on every step.</w:t>
+            </w:r>
+          </w:p>
+        </w:tc>
+        <w:tc>
+          <w:tcPr>
+            <w:tcW w:type="dxa" w:w="4032"/>
+          </w:tcPr>
+          <w:p>
+            <w:pPr>
+              <w:spacing w:after="40"/>
+            </w:pPr>
+            <w:r/>
+            <w:r>
+              <w:rPr>
+                <w:sz w:val="18"/>
+              </w:rPr>
+              <w:t>Removed from all of them.</w:t>
+            </w:r>
+          </w:p>
+        </w:tc>
+      </w:tr>
+      <w:tr>
+        <w:tc>
+          <w:tcPr>
+            <w:tcW w:type="dxa" w:w="5184"/>
+          </w:tcPr>
+          <w:p>
+            <w:pPr>
+              <w:spacing w:after="40"/>
+            </w:pPr>
+            <w:r/>
+            <w:r>
+              <w:rPr>
+                <w:sz w:val="18"/>
+              </w:rPr>
+              <w:t>The hotel agent has two tools doing one job in two steps (look up the city code, then search) when one tool does both.</w:t>
+            </w:r>
+          </w:p>
+        </w:tc>
+        <w:tc>
+          <w:tcPr>
+            <w:tcW w:type="dxa" w:w="4032"/>
+          </w:tcPr>
+          <w:p>
+            <w:pPr>
+              <w:spacing w:after="40"/>
+            </w:pPr>
+            <w:r/>
+            <w:r>
+              <w:rPr>
+                <w:sz w:val="18"/>
+              </w:rPr>
+              <w:t>Kept only the tool that does both.</w:t>
+            </w:r>
+          </w:p>
+        </w:tc>
+      </w:tr>
+      <w:tr>
+        <w:tc>
+          <w:tcPr>
+            <w:tcW w:type="dxa" w:w="5184"/>
+          </w:tcPr>
+          <w:p>
+            <w:pPr>
+              <w:spacing w:after="40"/>
+            </w:pPr>
+            <w:r/>
+            <w:r>
+              <w:rPr>
+                <w:sz w:val="18"/>
+              </w:rPr>
+              <w:t>The hotel agent also holds an attractions tool, so it can wander off instead of finishing.</w:t>
+            </w:r>
+          </w:p>
+        </w:tc>
+        <w:tc>
+          <w:tcPr>
+            <w:tcW w:type="dxa" w:w="4032"/>
+          </w:tcPr>
+          <w:p>
+            <w:pPr>
+              <w:spacing w:after="40"/>
+            </w:pPr>
+            <w:r/>
+            <w:r>
+              <w:rPr>
+                <w:sz w:val="18"/>
+              </w:rPr>
+              <w:t>One tool only. Nothing to wander to.</w:t>
+            </w:r>
+          </w:p>
+        </w:tc>
+      </w:tr>
+      <w:tr>
+        <w:tc>
+          <w:tcPr>
+            <w:tcW w:type="dxa" w:w="5184"/>
+          </w:tcPr>
+          <w:p>
+            <w:pPr>
+              <w:spacing w:after="40"/>
+            </w:pPr>
+            <w:r/>
+            <w:r>
+              <w:rPr>
+                <w:sz w:val="18"/>
+              </w:rPr>
+              <w:t>The coordinator holds four search tools, though its job is only to write the plan. It can re-search work already done.</w:t>
+            </w:r>
+          </w:p>
+        </w:tc>
+        <w:tc>
+          <w:tcPr>
+            <w:tcW w:type="dxa" w:w="4032"/>
+          </w:tcPr>
+          <w:p>
+            <w:pPr>
+              <w:spacing w:after="40"/>
+            </w:pPr>
+            <w:r/>
+            <w:r>
+              <w:rPr>
+                <w:sz w:val="18"/>
+              </w:rPr>
+              <w:t>No tools at all.</w:t>
+            </w:r>
+          </w:p>
+        </w:tc>
+      </w:tr>
+      <w:tr>
+        <w:tc>
+          <w:tcPr>
+            <w:tcW w:type="dxa" w:w="5184"/>
+          </w:tcPr>
+          <w:p>
+            <w:pPr>
+              <w:spacing w:after="40"/>
+            </w:pPr>
+            <w:r/>
+            <w:r>
+              <w:rPr>
+                <w:sz w:val="18"/>
+              </w:rPr>
+              <w:t>Tools hand the AI the full API reply.</w:t>
+            </w:r>
+          </w:p>
+        </w:tc>
+        <w:tc>
+          <w:tcPr>
+            <w:tcW w:type="dxa" w:w="4032"/>
+          </w:tcPr>
+          <w:p>
+            <w:pPr>
+              <w:spacing w:after="40"/>
+            </w:pPr>
+            <w:r/>
+            <w:r>
+              <w:rPr>
+                <w:sz w:val="18"/>
+              </w:rPr>
+              <w:t>Trimmed to the best few first.</w:t>
+            </w:r>
+          </w:p>
+        </w:tc>
+      </w:tr>
+    </w:tbl>
+    <w:p/>
     <w:p>
       <w:pPr>
         <w:pStyle w:val="Heading2"/>
@@ -2904,7 +3088,7 @@
     </w:p>
     <w:p>
       <w:r>
-        <w:t>This is worth being exact about, because "we built a tool server" and "the system calls it over the protocol" are different claims, and only the first is true of every approach.</w:t>
+        <w:t>Worth being exact about: "we built a tool server" and "the system calls it over the protocol" are different claims, and only the first is true of every approach.</w:t>
       </w:r>
     </w:p>
     <w:tbl>
@@ -3097,7 +3281,7 @@
     <w:p/>
     <w:p>
       <w:r>
-        <w:t>So the honest answer to "does the shipped system use the MCP server?" is: it calls the same twelve tool functions the server exposes, but in-process rather than over the protocol. The JSON-RPC transport is genuinely exercised — by approach B, and by the conformance audit that tests the server's twelve declared schemas against their implementations. Section 4 of the dissertation states this, and Section 7.2 assesses what it means for the objective the server was built to satisfy.</w:t>
+        <w:t>So: does the shipped system use the MCP server? It calls the same twelve tool functions the server exposes, but in-process rather than over the protocol. The JSON-RPC transport is exercised by approach B and by the conformance audit, which tests all twelve declared schemas against their implementations. Sections 4 and 7.2 of the dissertation state and assess this.</w:t>
       </w:r>
     </w:p>
     <w:p>
@@ -3225,339 +3409,111 @@
         <w:pStyle w:val="Heading2"/>
       </w:pPr>
       <w:r>
-        <w:t>The hotel agent, step by step</w:t>
+        <w:t>What "steps allowed" means</w:t>
       </w:r>
     </w:p>
     <w:p>
       <w:r>
-        <w:t>The same job in both: find a hotel in Istanbul, 15 to 19 August, about $80 a night.</w:t>
+        <w:t>An agent does not answer in one go. It loops: think, use a tool, read the result, think again. "Steps allowed" is how many times it may go round that loop before the framework stops it and forces an answer.</w:t>
       </w:r>
     </w:p>
-    <w:tbl>
-      <w:tblPr>
-        <w:tblStyle w:val="LightGrid-Accent1"/>
-        <w:tblW w:type="auto" w:w="0"/>
-        <w:tblLook w:firstColumn="1" w:firstRow="1" w:lastColumn="0" w:lastRow="0" w:noHBand="0" w:noVBand="1" w:val="04A0"/>
-      </w:tblPr>
-      <w:tblGrid>
-        <w:gridCol w:w="3216"/>
-        <w:gridCol w:w="3216"/>
-        <w:gridCol w:w="3216"/>
-      </w:tblGrid>
-      <w:tr>
-        <w:tc>
-          <w:tcPr>
-            <w:tcW w:type="dxa" w:w="648"/>
-          </w:tcPr>
-          <w:p>
-            <w:r/>
-            <w:r>
-              <w:rPr>
-                <w:b/>
-                <w:sz w:val="17"/>
-              </w:rPr>
-              <w:t>Step</w:t>
-            </w:r>
-          </w:p>
-        </w:tc>
-        <w:tc>
-          <w:tcPr>
-            <w:tcW w:type="dxa" w:w="4248"/>
-          </w:tcPr>
-          <w:p>
-            <w:r/>
-            <w:r>
-              <w:rPr>
-                <w:b/>
-                <w:sz w:val="17"/>
-              </w:rPr>
-              <w:t>Approach B</w:t>
-            </w:r>
-          </w:p>
-        </w:tc>
-        <w:tc>
-          <w:tcPr>
-            <w:tcW w:type="dxa" w:w="4248"/>
-          </w:tcPr>
-          <w:p>
-            <w:r/>
-            <w:r>
-              <w:rPr>
-                <w:b/>
-                <w:sz w:val="17"/>
-              </w:rPr>
-              <w:t>Approach C</w:t>
-            </w:r>
-          </w:p>
-        </w:tc>
-      </w:tr>
-      <w:tr>
-        <w:tc>
-          <w:tcPr>
-            <w:tcW w:type="dxa" w:w="648"/>
-          </w:tcPr>
-          <w:p>
-            <w:pPr>
-              <w:spacing w:after="40"/>
-            </w:pPr>
-            <w:r/>
-            <w:r>
-              <w:rPr>
-                <w:sz w:val="17"/>
-              </w:rPr>
-              <w:t>1</w:t>
-            </w:r>
-          </w:p>
-        </w:tc>
-        <w:tc>
-          <w:tcPr>
-            <w:tcW w:type="dxa" w:w="4248"/>
-          </w:tcPr>
-          <w:p>
-            <w:pPr>
-              <w:spacing w:after="40"/>
-            </w:pPr>
-            <w:r/>
-            <w:r>
-              <w:rPr>
-                <w:sz w:val="17"/>
-              </w:rPr>
-              <w:t>Sent to the AI: the request plus all EIGHT tool descriptions in full. The AI replies: 'look up Istanbul's ID code.' (one AI call)</w:t>
-            </w:r>
-          </w:p>
-        </w:tc>
-        <w:tc>
-          <w:tcPr>
-            <w:tcW w:type="dxa" w:w="4248"/>
-          </w:tcPr>
-          <w:p>
-            <w:pPr>
-              <w:spacing w:after="40"/>
-            </w:pPr>
-            <w:r/>
-            <w:r>
-              <w:rPr>
-                <w:sz w:val="17"/>
-              </w:rPr>
-              <w:t>Sent to the AI: the request plus ONE short tool description. The AI replies: 'find_hotels(Istanbul, 15 Aug, 19 Aug, 80).' (one AI call)</w:t>
-            </w:r>
-          </w:p>
-        </w:tc>
-      </w:tr>
-      <w:tr>
-        <w:tc>
-          <w:tcPr>
-            <w:tcW w:type="dxa" w:w="648"/>
-          </w:tcPr>
-          <w:p>
-            <w:pPr>
-              <w:spacing w:after="40"/>
-            </w:pPr>
-            <w:r/>
-            <w:r>
-              <w:rPr>
-                <w:sz w:val="17"/>
-              </w:rPr>
-              <w:t>2</w:t>
-            </w:r>
-          </w:p>
-        </w:tc>
-        <w:tc>
-          <w:tcPr>
-            <w:tcW w:type="dxa" w:w="4248"/>
-          </w:tcPr>
-          <w:p>
-            <w:pPr>
-              <w:spacing w:after="40"/>
-            </w:pPr>
-            <w:r/>
-            <w:r>
-              <w:rPr>
-                <w:sz w:val="17"/>
-              </w:rPr>
-              <w:t>The tool runs, through the MCP server over JSON-RPC, and returns the ID code.</w:t>
-            </w:r>
-          </w:p>
-        </w:tc>
-        <w:tc>
-          <w:tcPr>
-            <w:tcW w:type="dxa" w:w="4248"/>
-          </w:tcPr>
-          <w:p>
-            <w:pPr>
-              <w:spacing w:after="40"/>
-            </w:pPr>
-            <w:r/>
-            <w:r>
-              <w:rPr>
-                <w:sz w:val="17"/>
-              </w:rPr>
-              <w:t>The tool runs, calling the function directly, and returns the full reply — which is then TRIMMED to the best three hotels.</w:t>
-            </w:r>
-          </w:p>
-        </w:tc>
-      </w:tr>
-      <w:tr>
-        <w:tc>
-          <w:tcPr>
-            <w:tcW w:type="dxa" w:w="648"/>
-          </w:tcPr>
-          <w:p>
-            <w:pPr>
-              <w:spacing w:after="40"/>
-            </w:pPr>
-            <w:r/>
-            <w:r>
-              <w:rPr>
-                <w:sz w:val="17"/>
-              </w:rPr>
-              <w:t>3</w:t>
-            </w:r>
-          </w:p>
-        </w:tc>
-        <w:tc>
-          <w:tcPr>
-            <w:tcW w:type="dxa" w:w="4248"/>
-          </w:tcPr>
-          <w:p>
-            <w:pPr>
-              <w:spacing w:after="40"/>
-            </w:pPr>
-            <w:r/>
-            <w:r>
-              <w:rPr>
-                <w:sz w:val="17"/>
-              </w:rPr>
-              <w:t>The AI has forgotten everything, so all eight descriptions are sent AGAIN, plus the conversation so far. The AI replies: 'now search hotels.' (another AI call)</w:t>
-            </w:r>
-          </w:p>
-        </w:tc>
-        <w:tc>
-          <w:tcPr>
-            <w:tcW w:type="dxa" w:w="4248"/>
-          </w:tcPr>
-          <w:p>
-            <w:pPr>
-              <w:spacing w:after="40"/>
-            </w:pPr>
-            <w:r/>
-            <w:r>
-              <w:rPr>
-                <w:sz w:val="17"/>
-              </w:rPr>
-              <w:t>Sent: the request, the one description, and three short lines. The AI replies: 'Theodora Pension. Done.' (another AI call)</w:t>
-            </w:r>
-          </w:p>
-        </w:tc>
-      </w:tr>
-      <w:tr>
-        <w:tc>
-          <w:tcPr>
-            <w:tcW w:type="dxa" w:w="648"/>
-          </w:tcPr>
-          <w:p>
-            <w:pPr>
-              <w:spacing w:after="40"/>
-            </w:pPr>
-            <w:r/>
-            <w:r>
-              <w:rPr>
-                <w:sz w:val="17"/>
-              </w:rPr>
-              <w:t>4</w:t>
-            </w:r>
-          </w:p>
-        </w:tc>
-        <w:tc>
-          <w:tcPr>
-            <w:tcW w:type="dxa" w:w="4248"/>
-          </w:tcPr>
-          <w:p>
-            <w:pPr>
-              <w:spacing w:after="40"/>
-            </w:pPr>
-            <w:r/>
-            <w:r>
-              <w:rPr>
-                <w:sz w:val="17"/>
-              </w:rPr>
-              <w:t>The tool runs again and returns about 12,000 characters of hotel data.</w:t>
-            </w:r>
-          </w:p>
-        </w:tc>
-        <w:tc>
-          <w:tcPr>
-            <w:tcW w:type="dxa" w:w="4248"/>
-          </w:tcPr>
-          <w:p>
-            <w:pPr>
-              <w:spacing w:after="40"/>
-            </w:pPr>
-            <w:r/>
-            <w:r>
-              <w:rPr>
-                <w:sz w:val="17"/>
-              </w:rPr>
-              <w:t>FINISHED — two AI calls.</w:t>
-            </w:r>
-          </w:p>
-        </w:tc>
-      </w:tr>
-      <w:tr>
-        <w:tc>
-          <w:tcPr>
-            <w:tcW w:type="dxa" w:w="648"/>
-          </w:tcPr>
-          <w:p>
-            <w:pPr>
-              <w:spacing w:after="40"/>
-            </w:pPr>
-            <w:r/>
-            <w:r>
-              <w:rPr>
-                <w:sz w:val="17"/>
-              </w:rPr>
-              <w:t>5</w:t>
-            </w:r>
-          </w:p>
-        </w:tc>
-        <w:tc>
-          <w:tcPr>
-            <w:tcW w:type="dxa" w:w="4248"/>
-          </w:tcPr>
-          <w:p>
-            <w:pPr>
-              <w:spacing w:after="40"/>
-            </w:pPr>
-            <w:r/>
-            <w:r>
-              <w:rPr>
-                <w:sz w:val="17"/>
-              </w:rPr>
-              <w:t>All eight descriptions are sent a THIRD time, plus the whole conversation, plus all 12,000 characters for the AI to read. This can keep looping, up to ten steps.</w:t>
-            </w:r>
-          </w:p>
-        </w:tc>
-        <w:tc>
-          <w:tcPr>
-            <w:tcW w:type="dxa" w:w="4248"/>
-          </w:tcPr>
-          <w:p>
-            <w:pPr>
-              <w:spacing w:after="40"/>
-            </w:pPr>
-            <w:r/>
-            <w:r>
-              <w:rPr>
-                <w:sz w:val="17"/>
-              </w:rPr>
-              <w:t>—</w:t>
-            </w:r>
-          </w:p>
-        </w:tc>
-      </w:tr>
-    </w:tbl>
-    <w:p/>
+    <w:p>
+      <w:r>
+        <w:t>Each step is one full AI call. And because the AI has no memory, each step re-sends every tool description. So the setting matters twice over.</w:t>
+      </w:r>
+    </w:p>
+    <w:p>
+      <w:pPr>
+        <w:spacing w:after="160"/>
+        <w:ind w:left="288"/>
+      </w:pPr>
+      <w:r>
+        <w:rPr>
+          <w:rFonts w:ascii="Consolas" w:hAnsi="Consolas"/>
+          <w:sz w:val="18"/>
+        </w:rPr>
+        <w:t xml:space="preserve">  APPROACH B  --  hotel agent: 8 tools, 10 steps allowed</w:t>
+        <w:br/>
+        <w:br/>
+        <w:t xml:space="preserve">  STEP 1   AI is sent: the job + ALL 8 tool descriptions</w:t>
+        <w:br/>
+        <w:t xml:space="preserve">           AI answers: "look up Istanbul's ID code"        &lt;- 1 AI call</w:t>
+        <w:br/>
+        <w:t xml:space="preserve">           tool runs -&gt; gets: dest_id -755070</w:t>
+        <w:br/>
+        <w:br/>
+        <w:t xml:space="preserve">  STEP 2   AI is sent: the job + ALL 8 descriptions AGAIN + what happened</w:t>
+        <w:br/>
+        <w:t xml:space="preserve">           AI answers: "now search hotels with that code"  &lt;- 1 AI call</w:t>
+        <w:br/>
+        <w:t xml:space="preserve">           tool runs -&gt; gets: 12,000 characters of hotels</w:t>
+        <w:br/>
+        <w:br/>
+        <w:t xml:space="preserve">  STEP 3   AI is sent: the job + ALL 8 descriptions AGAIN + everything so far</w:t>
+        <w:br/>
+        <w:t xml:space="preserve">                       + all 12,000 characters</w:t>
+        <w:br/>
+        <w:t xml:space="preserve">           AI answers: "let me check the reviews too"      &lt;- 1 AI call</w:t>
+        <w:br/>
+        <w:br/>
+        <w:t xml:space="preserve">  STEP 4   ...again... "let me look at nearby attractions" &lt;- 1 AI call</w:t>
+        <w:br/>
+        <w:t xml:space="preserve">  STEP 5   ...again... "let me search the web to compare"  &lt;- 1 AI call</w:t>
+        <w:br/>
+        <w:t xml:space="preserve">  STEP 6   ...again... "let me total up 4 nights"          &lt;- 1 AI call</w:t>
+        <w:br/>
+        <w:t xml:space="preserve">  STEP 7-10  it may keep going. At step 10 it is cut off and</w:t>
+        <w:br/>
+        <w:t xml:space="preserve">             must answer with whatever it has.</w:t>
+        <w:br/>
+        <w:br/>
+        <w:t xml:space="preserve">  Result: about 6 AI calls for one hotel, and 8 descriptions re-sent</w:t>
+        <w:br/>
+        <w:t xml:space="preserve">          on every single one of them.</w:t>
+      </w:r>
+    </w:p>
+    <w:p>
+      <w:pPr>
+        <w:spacing w:after="160"/>
+        <w:ind w:left="288"/>
+      </w:pPr>
+      <w:r>
+        <w:rPr>
+          <w:rFonts w:ascii="Consolas" w:hAnsi="Consolas"/>
+          <w:sz w:val="18"/>
+        </w:rPr>
+        <w:t xml:space="preserve">  APPROACH C  --  hotel agent: 1 tool, 3 steps allowed</w:t>
+        <w:br/>
+        <w:br/>
+        <w:t xml:space="preserve">  STEP 1   AI is sent: the job + ONE short description</w:t>
+        <w:br/>
+        <w:t xml:space="preserve">           AI answers: "find_hotels('Istanbul', 15 Aug, 19 Aug, 80)"  &lt;- 1 AI call</w:t>
+        <w:br/>
+        <w:t xml:space="preserve">           tool runs -&gt; gets 12,000 characters -&gt; TRIMMED to the best 3</w:t>
+        <w:br/>
+        <w:br/>
+        <w:t xml:space="preserve">  STEP 2   AI is sent: the job + the one description + 3 short lines</w:t>
+        <w:br/>
+        <w:t xml:space="preserve">                       Theodora Pension  $33/night  10/10</w:t>
+        <w:br/>
+        <w:t xml:space="preserve">                       Hotel Sultania    $41/night   9/10</w:t>
+        <w:br/>
+        <w:t xml:space="preserve">                       Ada Homes         $38/night   9/10</w:t>
+        <w:br/>
+        <w:t xml:space="preserve">           AI answers: "Theodora Pension. Done."                      &lt;- 1 AI call</w:t>
+        <w:br/>
+        <w:br/>
+        <w:t xml:space="preserve">  STEP 3   not needed. It finished on its own.</w:t>
+        <w:br/>
+        <w:br/>
+        <w:t xml:space="preserve">  Result: 2 AI calls, and there was nothing to wander off to.</w:t>
+      </w:r>
+    </w:p>
+    <w:p>
+      <w:r>
+        <w:t>Same job. Same hotel chosen. Six AI calls against two — because B could wander, and C had nowhere to wander to.</w:t>
+      </w:r>
+    </w:p>
     <w:p>
       <w:pPr>
         <w:pStyle w:val="Heading2"/>
@@ -3954,12 +3910,12 @@
     <w:p/>
     <w:p>
       <w:r>
-        <w:t>The first three cut token use by about 89%. The fourth is why it finished roughly ten times faster. Nothing about the architecture changed — no agent added, no agent removed, no API swapped.</w:t>
+        <w:t>The first three cut token use by about 89%. The fourth made it roughly ten times faster. No agent was added or removed and no API was swapped.</w:t>
       </w:r>
     </w:p>
     <w:p>
       <w:r>
-        <w:t>And that is what raised the question approach D answers. In step 1 above, approach B spent an entire AI call deciding "look up Istanbul's ID code" — but there was exactly one correct thing to do there. No judgement at all. So why is the AI in the lookup step? It is not, in approach D.</w:t>
+        <w:t>Which raised the question approach D answers. In step 1 above, B spent a whole AI call deciding "look up Istanbul's ID code" — but there was exactly one correct thing to do. No judgement at all. So why is the AI in the lookup step? In approach D it is not.</w:t>
       </w:r>
     </w:p>
     <w:p>

</xml_diff>

<commit_message>
Rebuild both documents; 358 tests now, was 329
Perturbation proof passes, Cohen's kappa still 0.643, budget_gate.json still
byte-identical. No live API calls were made for any of this work — 11 flight and
24 hotel searches remain.
</commit_message>
<xml_diff>
--- a/PROJECT_OVERVIEW.docx
+++ b/PROJECT_OVERVIEW.docx
@@ -7438,6 +7438,42 @@
                 <w:sz w:val="18"/>
               </w:rPr>
               <w:t>The web page itself.</w:t>
+            </w:r>
+          </w:p>
+        </w:tc>
+      </w:tr>
+      <w:tr>
+        <w:tc>
+          <w:tcPr>
+            <w:tcW w:type="dxa" w:w="2736"/>
+          </w:tcPr>
+          <w:p>
+            <w:pPr>
+              <w:spacing w:after="40"/>
+            </w:pPr>
+            <w:r/>
+            <w:r>
+              <w:rPr>
+                <w:sz w:val="18"/>
+              </w:rPr>
+              <w:t>plan_layout.py</w:t>
+            </w:r>
+          </w:p>
+        </w:tc>
+        <w:tc>
+          <w:tcPr>
+            <w:tcW w:type="dxa" w:w="6480"/>
+          </w:tcPr>
+          <w:p>
+            <w:pPr>
+              <w:spacing w:after="40"/>
+            </w:pPr>
+            <w:r/>
+            <w:r>
+              <w:rPr>
+                <w:sz w:val="18"/>
+              </w:rPr>
+              <w:t>(not yet described)</w:t>
             </w:r>
           </w:p>
         </w:tc>

</xml_diff>

<commit_message>
Rebuild all three deliverables
Main body 13,167 words, 33 inside the ceiling. Perturbation proof passes, kappa
still 0.643, budget_gate.json byte-identical, 393 tests pass. No live API calls.
</commit_message>
<xml_diff>
--- a/PROJECT_OVERVIEW.docx
+++ b/PROJECT_OVERVIEW.docx
@@ -6232,7 +6232,9 @@
         <w:br/>
         <w:t xml:space="preserve">    core\                 caching, measuring, budget, cost, safe maths</w:t>
         <w:br/>
-        <w:t xml:space="preserve">    ui\app.py             the web page</w:t>
+        <w:t xml:space="preserve">    ui\                   the web page, and the code that splits a</w:t>
+        <w:br/>
+        <w:t xml:space="preserve">                           finished plan into its sections</w:t>
         <w:br/>
         <w:br/>
         <w:t xml:space="preserve">  evaluation\             THE EXPERIMENT</w:t>
@@ -6268,9 +6270,13 @@
         <w:t xml:space="preserve">    figures\                     all 14 pictures, generated</w:t>
         <w:br/>
         <w:br/>
-        <w:t xml:space="preserve">  testing\                the test suite</w:t>
+        <w:t xml:space="preserve">  testing\                the test suite (393 tests), plus two</w:t>
+        <w:br/>
+        <w:t xml:space="preserve">                           real finished plans used as fixtures</w:t>
         <w:br/>
         <w:t xml:space="preserve">  proposal\               the original proposal and the assignment brief</w:t>
+        <w:br/>
+        <w:t xml:space="preserve">  .streamlit\             the web page's colour theme</w:t>
         <w:br/>
         <w:t xml:space="preserve">  .api_cache\             recorded website replies, so results replay free</w:t>
       </w:r>

</xml_diff>